<commit_message>
Rédaction des différentes docs
Tweak Compte-rendu attendu.md (adjusted strikethrough content in the INFO section) and update several binary documentation files (Dossier conception.docx, IHM_Hub.odg, Rapport communication.docx). Remove legacy Usage du hub d'alarme.doc and add a .docx replacement (Usage du hub d'alarme.docx) to standardize formats.
</commit_message>
<xml_diff>
--- a/IHM_Hub/Dossier conception.docx
+++ b/IHM_Hub/Dossier conception.docx
@@ -5,30 +5,20 @@
     <w:p>
       <w:pPr>
         <w:pStyle w:val="Titre"/>
-        <w:jc w:val="center"/>
-        <w:rPr>
-          <w:b/>
-          <w:bCs/>
-        </w:rPr>
-      </w:pPr>
-      <w:r>
-        <w:rPr>
-          <w:b/>
-          <w:bCs/>
-        </w:rPr>
-        <w:t>Dossier de conception</w:t>
-      </w:r>
-      <w:r>
-        <w:rPr>
-          <w:b/>
-          <w:bCs/>
-        </w:rPr>
+      </w:pPr>
+      <w:r>
+        <w:t>Dossier</w:t>
+      </w:r>
+      <w:r>
+        <w:t xml:space="preserve"> de conception</w:t>
+      </w:r>
+      <w:r>
         <w:t xml:space="preserve"> du HUB central</w:t>
       </w:r>
     </w:p>
     <w:p>
       <w:pPr>
-        <w:pStyle w:val="Sous-titre"/>
+        <w:pStyle w:val="Titre1"/>
       </w:pPr>
       <w:r>
         <w:t>Organisation</w:t>
@@ -96,24 +86,10 @@
     </w:p>
     <w:p>
       <w:pPr>
-        <w:pStyle w:val="Sous-titre"/>
+        <w:pStyle w:val="Titre1"/>
       </w:pPr>
       <w:r>
         <w:t>Découpage en tâche</w:t>
-      </w:r>
-    </w:p>
-    <w:p>
-      <w:r>
-        <w:t xml:space="preserve">Voici le découpage fonctionnel et technique des tâches du </w:t>
-      </w:r>
-      <w:r>
-        <w:t>projet</w:t>
-      </w:r>
-      <w:r>
-        <w:t xml:space="preserve"> </w:t>
-      </w:r>
-      <w:r>
-        <w:t>:</w:t>
       </w:r>
     </w:p>
     <w:p>
@@ -621,7 +597,7 @@
       </w:r>
       <w:proofErr w:type="spellEnd"/>
       <w:r>
-        <w:t>) pour fournir un retour visuel lors du relâchement des boutons tactiles.</w:t>
+        <w:t>) pour fournir un retour visuel lors du relâchement des boutons tactiles</w:t>
       </w:r>
     </w:p>
     <w:p>
@@ -653,7 +629,14 @@
           <w:b/>
           <w:bCs/>
         </w:rPr>
-        <w:t>Gestion de la persistance</w:t>
+        <w:t xml:space="preserve">Gestion de la </w:t>
+      </w:r>
+      <w:r>
+        <w:rPr>
+          <w:b/>
+          <w:bCs/>
+        </w:rPr>
+        <w:t>mémoire</w:t>
       </w:r>
     </w:p>
     <w:p>
@@ -664,7 +647,7 @@
         </w:numPr>
       </w:pPr>
       <w:r>
-        <w:t>Écriture et lecture des chaînes de caractères pour les mots de passe utilisateur (</w:t>
+        <w:t>Écriture et lecture des mots de passe utilisateur (</w:t>
       </w:r>
       <w:proofErr w:type="spellStart"/>
       <w:r>
@@ -680,7 +663,7 @@
       </w:r>
       <w:proofErr w:type="spellEnd"/>
       <w:r>
-        <w:t>).</w:t>
+        <w:t>)</w:t>
       </w:r>
     </w:p>
     <w:p>
@@ -691,7 +674,7 @@
         </w:numPr>
       </w:pPr>
       <w:r>
-        <w:t>Conception des fonctions de sérialisation et désérialisation de la liste des badges RFID (conversion d'un vecteur de chaînes en une chaîne unique segmentée par des points-virgules ;).</w:t>
+        <w:t>Mémorisation des badges RFID</w:t>
       </w:r>
     </w:p>
     <w:p>
@@ -702,26 +685,515 @@
         </w:numPr>
       </w:pPr>
       <w:r>
-        <w:t>Enregistrement systématique de l'état de l'alarme (</w:t>
-      </w:r>
+        <w:t>Enregistrement de l’écran actuel et de l’état de l’alarme</w:t>
+      </w:r>
+    </w:p>
+    <w:p>
+      <w:pPr>
+        <w:pStyle w:val="Titre1"/>
+      </w:pPr>
+      <w:r>
+        <w:t>Structure de données</w:t>
+      </w:r>
+    </w:p>
+    <w:p>
+      <w:pPr>
+        <w:rPr>
+          <w:b/>
+          <w:bCs/>
+        </w:rPr>
+      </w:pPr>
+      <w:r>
+        <w:rPr>
+          <w:b/>
+          <w:bCs/>
+        </w:rPr>
+        <w:t>1. Structures et Énumérations</w:t>
+      </w:r>
+    </w:p>
+    <w:p>
+      <w:pPr>
+        <w:numPr>
+          <w:ilvl w:val="0"/>
+          <w:numId w:val="7"/>
+        </w:numPr>
+      </w:pPr>
       <w:proofErr w:type="spellStart"/>
       <w:r>
-        <w:t>locked_state</w:t>
+        <w:rPr>
+          <w:b/>
+          <w:bCs/>
+        </w:rPr>
+        <w:t>t_message_lcd</w:t>
       </w:r>
       <w:proofErr w:type="spellEnd"/>
       <w:r>
-        <w:t>) et de l'écran en cours (</w:t>
-      </w:r>
+        <w:rPr>
+          <w:b/>
+          <w:bCs/>
+        </w:rPr>
+        <w:t xml:space="preserve"> (Structure)</w:t>
+      </w:r>
+      <w:r>
+        <w:t xml:space="preserve"> : Regroupe un tableau de caractères msg de taille TRAME_SIZE (128 octets) destiné au texte à afficher, et un entier ligne indiquant l'index de la ligne d'affichage</w:t>
+      </w:r>
+    </w:p>
+    <w:p>
+      <w:pPr>
+        <w:numPr>
+          <w:ilvl w:val="0"/>
+          <w:numId w:val="7"/>
+        </w:numPr>
+      </w:pPr>
+      <w:r>
+        <w:rPr>
+          <w:b/>
+          <w:bCs/>
+        </w:rPr>
+        <w:t>Screen (Énumération)</w:t>
+      </w:r>
+      <w:r>
+        <w:t xml:space="preserve"> : </w:t>
+      </w:r>
+      <w:r>
+        <w:t xml:space="preserve">Pour la machine </w:t>
+      </w:r>
+      <w:r>
+        <w:t>à états de l'interface graphique avec 7 écrans possibles (HOME, OPTIONS, ALARM, PAIRING, KEYPAD, CHANGE_PWD, RFID_LIST)</w:t>
+      </w:r>
+    </w:p>
+    <w:p>
+      <w:pPr>
+        <w:numPr>
+          <w:ilvl w:val="0"/>
+          <w:numId w:val="7"/>
+        </w:numPr>
+      </w:pPr>
       <w:proofErr w:type="spellStart"/>
       <w:r>
-        <w:t>saved_screen</w:t>
+        <w:rPr>
+          <w:b/>
+          <w:bCs/>
+        </w:rPr>
+        <w:t>PwdChangeStep</w:t>
       </w:r>
       <w:proofErr w:type="spellEnd"/>
       <w:r>
-        <w:t>) lors de chaque transition, garantissant une reprise logicielle identique en cas de coupure d'alimentation.</w:t>
+        <w:rPr>
+          <w:b/>
+          <w:bCs/>
+        </w:rPr>
+        <w:t xml:space="preserve"> (Énumération)</w:t>
+      </w:r>
+      <w:r>
+        <w:t xml:space="preserve"> : </w:t>
+      </w:r>
+      <w:r>
+        <w:t xml:space="preserve">Permet </w:t>
+      </w:r>
+      <w:r>
+        <w:t>la</w:t>
+      </w:r>
+      <w:r>
+        <w:t xml:space="preserve"> logique séquentielle de modification du code PIN en 3 étapes (ENTER_OLD, ENTER_NEW, CONFIRM_NEW)</w:t>
+      </w:r>
+    </w:p>
+    <w:p>
+      <w:pPr>
+        <w:rPr>
+          <w:b/>
+          <w:bCs/>
+        </w:rPr>
+      </w:pPr>
+      <w:r>
+        <w:rPr>
+          <w:b/>
+          <w:bCs/>
+        </w:rPr>
+        <w:t>2. Conteneurs et Variables de Statut</w:t>
+      </w:r>
+    </w:p>
+    <w:p>
+      <w:pPr>
+        <w:numPr>
+          <w:ilvl w:val="0"/>
+          <w:numId w:val="8"/>
+        </w:numPr>
+      </w:pPr>
+      <w:proofErr w:type="spellStart"/>
+      <w:r>
+        <w:rPr>
+          <w:b/>
+          <w:bCs/>
+        </w:rPr>
+        <w:t>rfidBadges</w:t>
+      </w:r>
+      <w:proofErr w:type="spellEnd"/>
+      <w:r>
+        <w:rPr>
+          <w:b/>
+          <w:bCs/>
+        </w:rPr>
+        <w:t xml:space="preserve"> (std::</w:t>
+      </w:r>
+      <w:proofErr w:type="spellStart"/>
+      <w:r>
+        <w:rPr>
+          <w:b/>
+          <w:bCs/>
+        </w:rPr>
+        <w:t>vector</w:t>
+      </w:r>
+      <w:proofErr w:type="spellEnd"/>
+      <w:r>
+        <w:rPr>
+          <w:b/>
+          <w:bCs/>
+        </w:rPr>
+        <w:t>&lt;String&gt;)</w:t>
+      </w:r>
+      <w:r>
+        <w:t xml:space="preserve"> : Vecteur dynamique pour stocker en mémoire</w:t>
+      </w:r>
+      <w:r>
+        <w:t xml:space="preserve"> </w:t>
+      </w:r>
+      <w:r>
+        <w:t>la liste</w:t>
+      </w:r>
+      <w:r>
+        <w:t xml:space="preserve"> </w:t>
+      </w:r>
+      <w:r>
+        <w:t>des badges RFID</w:t>
+      </w:r>
+      <w:r>
+        <w:t xml:space="preserve"> enregistrés</w:t>
+      </w:r>
+    </w:p>
+    <w:p>
+      <w:pPr>
+        <w:numPr>
+          <w:ilvl w:val="0"/>
+          <w:numId w:val="8"/>
+        </w:numPr>
+      </w:pPr>
+      <w:r>
+        <w:rPr>
+          <w:b/>
+          <w:bCs/>
+        </w:rPr>
+        <w:t>Chaînes de caractères de configuration (String)</w:t>
+      </w:r>
+      <w:r>
+        <w:t xml:space="preserve"> :</w:t>
+      </w:r>
+    </w:p>
+    <w:p>
+      <w:pPr>
+        <w:numPr>
+          <w:ilvl w:val="1"/>
+          <w:numId w:val="8"/>
+        </w:numPr>
+      </w:pPr>
+      <w:proofErr w:type="spellStart"/>
+      <w:r>
+        <w:t>keyboardPwd</w:t>
+      </w:r>
+      <w:proofErr w:type="spellEnd"/>
+      <w:r>
+        <w:t xml:space="preserve"> et </w:t>
+      </w:r>
+      <w:proofErr w:type="spellStart"/>
+      <w:r>
+        <w:t>PassAdmin</w:t>
+      </w:r>
+      <w:proofErr w:type="spellEnd"/>
+      <w:r>
+        <w:t xml:space="preserve"> : Stockent les codes d'accès (clavier et administrateur)</w:t>
+      </w:r>
+    </w:p>
+    <w:p>
+      <w:pPr>
+        <w:numPr>
+          <w:ilvl w:val="1"/>
+          <w:numId w:val="8"/>
+        </w:numPr>
+      </w:pPr>
+      <w:proofErr w:type="spellStart"/>
+      <w:r>
+        <w:t>IDdigi</w:t>
+      </w:r>
+      <w:proofErr w:type="spellEnd"/>
+      <w:r>
+        <w:t xml:space="preserve"> et </w:t>
+      </w:r>
+      <w:proofErr w:type="spellStart"/>
+      <w:r>
+        <w:t>IDhub</w:t>
+      </w:r>
+      <w:proofErr w:type="spellEnd"/>
+      <w:r>
+        <w:t xml:space="preserve"> : Stockent les adresses MAC respectives du digicode distant et de la carte locale</w:t>
+      </w:r>
+    </w:p>
+    <w:p>
+      <w:pPr>
+        <w:numPr>
+          <w:ilvl w:val="1"/>
+          <w:numId w:val="8"/>
+        </w:numPr>
+      </w:pPr>
+      <w:proofErr w:type="spellStart"/>
+      <w:r>
+        <w:t>enteredPin</w:t>
+      </w:r>
+      <w:proofErr w:type="spellEnd"/>
+      <w:r>
+        <w:t xml:space="preserve"> et </w:t>
+      </w:r>
+      <w:proofErr w:type="spellStart"/>
+      <w:r>
+        <w:t>tempNewPwd</w:t>
+      </w:r>
+      <w:proofErr w:type="spellEnd"/>
+      <w:r>
+        <w:t xml:space="preserve"> : Tampons de saisie dynamique pour le pavé numérique</w:t>
       </w:r>
     </w:p>
     <w:p/>
+    <w:p/>
+    <w:p>
+      <w:pPr>
+        <w:rPr>
+          <w:b/>
+          <w:bCs/>
+        </w:rPr>
+      </w:pPr>
+      <w:r>
+        <w:rPr>
+          <w:b/>
+          <w:bCs/>
+        </w:rPr>
+        <w:lastRenderedPageBreak/>
+        <w:t>3. Tampons et Objets de l'Architecture Temps Réel (</w:t>
+      </w:r>
+      <w:proofErr w:type="spellStart"/>
+      <w:r>
+        <w:rPr>
+          <w:b/>
+          <w:bCs/>
+        </w:rPr>
+        <w:t>FreeRTOS</w:t>
+      </w:r>
+      <w:proofErr w:type="spellEnd"/>
+      <w:r>
+        <w:rPr>
+          <w:b/>
+          <w:bCs/>
+        </w:rPr>
+        <w:t>)</w:t>
+      </w:r>
+    </w:p>
+    <w:p>
+      <w:pPr>
+        <w:numPr>
+          <w:ilvl w:val="0"/>
+          <w:numId w:val="9"/>
+        </w:numPr>
+      </w:pPr>
+      <w:proofErr w:type="spellStart"/>
+      <w:r>
+        <w:rPr>
+          <w:b/>
+          <w:bCs/>
+        </w:rPr>
+        <w:t>displayBuffer</w:t>
+      </w:r>
+      <w:proofErr w:type="spellEnd"/>
+      <w:r>
+        <w:rPr>
+          <w:b/>
+          <w:bCs/>
+        </w:rPr>
+        <w:t>[4][TRAME_SIZE] (Tableau 2D de char)</w:t>
+      </w:r>
+      <w:r>
+        <w:t xml:space="preserve"> : Matrice fixe pour conserver les chaînes de caractères des 4 derniers messages de log affichés à l'écran</w:t>
+      </w:r>
+    </w:p>
+    <w:p>
+      <w:pPr>
+        <w:numPr>
+          <w:ilvl w:val="0"/>
+          <w:numId w:val="9"/>
+        </w:numPr>
+      </w:pPr>
+      <w:proofErr w:type="spellStart"/>
+      <w:r>
+        <w:rPr>
+          <w:b/>
+          <w:bCs/>
+        </w:rPr>
+        <w:t>queueReceptionSerie</w:t>
+      </w:r>
+      <w:proofErr w:type="spellEnd"/>
+      <w:r>
+        <w:rPr>
+          <w:b/>
+          <w:bCs/>
+        </w:rPr>
+        <w:t xml:space="preserve"> (</w:t>
+      </w:r>
+      <w:proofErr w:type="spellStart"/>
+      <w:r>
+        <w:rPr>
+          <w:b/>
+          <w:bCs/>
+        </w:rPr>
+        <w:t>QueueHandle_t</w:t>
+      </w:r>
+      <w:proofErr w:type="spellEnd"/>
+      <w:r>
+        <w:rPr>
+          <w:b/>
+          <w:bCs/>
+        </w:rPr>
+        <w:t>)</w:t>
+      </w:r>
+      <w:r>
+        <w:t xml:space="preserve"> : File d'attente pour stocker </w:t>
+      </w:r>
+      <w:r>
+        <w:t>les valeurs</w:t>
+      </w:r>
+      <w:r>
+        <w:t xml:space="preserve"> char </w:t>
+      </w:r>
+      <w:r>
+        <w:t>afin</w:t>
+      </w:r>
+      <w:r>
+        <w:t xml:space="preserve"> de transférer les octets reçus vers la tâche de traitement de trame</w:t>
+      </w:r>
+    </w:p>
+    <w:p>
+      <w:pPr>
+        <w:numPr>
+          <w:ilvl w:val="0"/>
+          <w:numId w:val="9"/>
+        </w:numPr>
+      </w:pPr>
+      <w:proofErr w:type="spellStart"/>
+      <w:r>
+        <w:rPr>
+          <w:b/>
+          <w:bCs/>
+        </w:rPr>
+        <w:t>queueAffichage</w:t>
+      </w:r>
+      <w:proofErr w:type="spellEnd"/>
+      <w:r>
+        <w:rPr>
+          <w:b/>
+          <w:bCs/>
+        </w:rPr>
+        <w:t xml:space="preserve"> (</w:t>
+      </w:r>
+      <w:proofErr w:type="spellStart"/>
+      <w:r>
+        <w:rPr>
+          <w:b/>
+          <w:bCs/>
+        </w:rPr>
+        <w:t>QueueHandle_t</w:t>
+      </w:r>
+      <w:proofErr w:type="spellEnd"/>
+      <w:r>
+        <w:rPr>
+          <w:b/>
+          <w:bCs/>
+        </w:rPr>
+        <w:t>)</w:t>
+      </w:r>
+      <w:r>
+        <w:t xml:space="preserve"> : File d'attente d'une capacité de 3 éléments stockant des </w:t>
+      </w:r>
+      <w:proofErr w:type="spellStart"/>
+      <w:r>
+        <w:t>struct</w:t>
+      </w:r>
+      <w:proofErr w:type="spellEnd"/>
+      <w:r>
+        <w:t xml:space="preserve"> </w:t>
+      </w:r>
+      <w:proofErr w:type="spellStart"/>
+      <w:r>
+        <w:t>t_message_lcd</w:t>
+      </w:r>
+      <w:proofErr w:type="spellEnd"/>
+      <w:r>
+        <w:t xml:space="preserve"> pour centraliser les requêtes d'affichage</w:t>
+      </w:r>
+    </w:p>
+    <w:p>
+      <w:pPr>
+        <w:numPr>
+          <w:ilvl w:val="0"/>
+          <w:numId w:val="9"/>
+        </w:numPr>
+      </w:pPr>
+      <w:proofErr w:type="spellStart"/>
+      <w:r>
+        <w:rPr>
+          <w:b/>
+          <w:bCs/>
+        </w:rPr>
+        <w:t>lcdMutex</w:t>
+      </w:r>
+      <w:proofErr w:type="spellEnd"/>
+      <w:r>
+        <w:rPr>
+          <w:b/>
+          <w:bCs/>
+        </w:rPr>
+        <w:t xml:space="preserve"> (</w:t>
+      </w:r>
+      <w:proofErr w:type="spellStart"/>
+      <w:r>
+        <w:rPr>
+          <w:b/>
+          <w:bCs/>
+        </w:rPr>
+        <w:t>SemaphoreHandle_t</w:t>
+      </w:r>
+      <w:proofErr w:type="spellEnd"/>
+      <w:r>
+        <w:rPr>
+          <w:b/>
+          <w:bCs/>
+        </w:rPr>
+        <w:t>)</w:t>
+      </w:r>
+      <w:r>
+        <w:t xml:space="preserve"> : Mutex </w:t>
+      </w:r>
+      <w:r>
+        <w:t>pour</w:t>
+      </w:r>
+      <w:r>
+        <w:t xml:space="preserve"> </w:t>
+      </w:r>
+      <w:r>
+        <w:t xml:space="preserve">éviter que deux opérations sur le LCD </w:t>
+      </w:r>
+      <w:r>
+        <w:t>n’aient</w:t>
+      </w:r>
+      <w:r>
+        <w:t xml:space="preserve"> lieu simultanément</w:t>
+      </w:r>
+    </w:p>
     <w:sectPr>
       <w:pgSz w:w="11906" w:h="16838"/>
       <w:pgMar w:top="1417" w:right="1417" w:bottom="1417" w:left="1417" w:header="708" w:footer="708" w:gutter="0"/>
@@ -735,6 +1207,155 @@
 <file path=word/numbering.xml><?xml version="1.0" encoding="utf-8"?>
 <w:numbering xmlns:wpc="http://schemas.microsoft.com/office/word/2010/wordprocessingCanvas" xmlns:cx="http://schemas.microsoft.com/office/drawing/2014/chartex" xmlns:cx1="http://schemas.microsoft.com/office/drawing/2015/9/8/chartex" xmlns:cx2="http://schemas.microsoft.com/office/drawing/2015/10/21/chartex" xmlns:cx3="http://schemas.microsoft.com/office/drawing/2016/5/9/chartex" xmlns:cx4="http://schemas.microsoft.com/office/drawing/2016/5/10/chartex" xmlns:cx5="http://schemas.microsoft.com/office/drawing/2016/5/11/chartex" xmlns:cx6="http://schemas.microsoft.com/office/drawing/2016/5/12/chartex" xmlns:cx7="http://schemas.microsoft.com/office/drawing/2016/5/13/chartex" xmlns:cx8="http://schemas.microsoft.com/office/drawing/2016/5/14/chartex" xmlns:mc="http://schemas.openxmlformats.org/markup-compatibility/2006" xmlns:aink="http://schemas.microsoft.com/office/drawing/2016/ink" xmlns:am3d="http://schemas.microsoft.com/office/drawing/2017/model3d" xmlns:o="urn:schemas-microsoft-com:office:office" xmlns:oel="http://schemas.microsoft.com/office/2019/extlst" xmlns:r="http://schemas.openxmlformats.org/officeDocument/2006/relationships" xmlns:m="http://schemas.openxmlformats.org/officeDocument/2006/math" xmlns:v="urn:schemas-microsoft-com:vml" xmlns:wp14="http://schemas.microsoft.com/office/word/2010/wordprocessingDrawing" xmlns:wp="http://schemas.openxmlformats.org/drawingml/2006/wordprocessingDrawing" xmlns:w10="urn:schemas-microsoft-com:office:word" xmlns:w="http://schemas.openxmlformats.org/wordprocessingml/2006/main" xmlns:w14="http://schemas.microsoft.com/office/word/2010/wordml" xmlns:w15="http://schemas.microsoft.com/office/word/2012/wordml" xmlns:w16cex="http://schemas.microsoft.com/office/word/2018/wordml/cex" xmlns:w16cid="http://schemas.microsoft.com/office/word/2016/wordml/cid" xmlns:w16="http://schemas.microsoft.com/office/word/2018/wordml" xmlns:w16du="http://schemas.microsoft.com/office/word/2023/wordml/word16du" xmlns:w16sdtdh="http://schemas.microsoft.com/office/word/2020/wordml/sdtdatahash" xmlns:w16sdtfl="http://schemas.microsoft.com/office/word/2024/wordml/sdtformatlock" xmlns:w16se="http://schemas.microsoft.com/office/word/2015/wordml/symex" xmlns:wpg="http://schemas.microsoft.com/office/word/2010/wordprocessingGroup" xmlns:wpi="http://schemas.microsoft.com/office/word/2010/wordprocessingInk" xmlns:wne="http://schemas.microsoft.com/office/word/2006/wordml" xmlns:wps="http://schemas.microsoft.com/office/word/2010/wordprocessingShape" mc:Ignorable="w14 w15 w16se w16cid w16 w16cex w16sdtdh w16sdtfl w16du wp14">
   <w:abstractNum w:abstractNumId="0" w15:restartNumberingAfterBreak="0">
+    <w:nsid w:val="0CA1323F"/>
+    <w:multiLevelType w:val="multilevel"/>
+    <w:tmpl w:val="B94C411C"/>
+    <w:lvl w:ilvl="0">
+      <w:start w:val="1"/>
+      <w:numFmt w:val="bullet"/>
+      <w:lvlText w:val=""/>
+      <w:lvlJc w:val="left"/>
+      <w:pPr>
+        <w:tabs>
+          <w:tab w:val="num" w:pos="720"/>
+        </w:tabs>
+        <w:ind w:left="720" w:hanging="360"/>
+      </w:pPr>
+      <w:rPr>
+        <w:rFonts w:ascii="Symbol" w:hAnsi="Symbol" w:hint="default"/>
+        <w:sz w:val="20"/>
+      </w:rPr>
+    </w:lvl>
+    <w:lvl w:ilvl="1">
+      <w:start w:val="1"/>
+      <w:numFmt w:val="bullet"/>
+      <w:lvlText w:val="o"/>
+      <w:lvlJc w:val="left"/>
+      <w:pPr>
+        <w:tabs>
+          <w:tab w:val="num" w:pos="1440"/>
+        </w:tabs>
+        <w:ind w:left="1440" w:hanging="360"/>
+      </w:pPr>
+      <w:rPr>
+        <w:rFonts w:ascii="Courier New" w:hAnsi="Courier New" w:hint="default"/>
+        <w:sz w:val="20"/>
+      </w:rPr>
+    </w:lvl>
+    <w:lvl w:ilvl="2" w:tentative="1">
+      <w:start w:val="1"/>
+      <w:numFmt w:val="bullet"/>
+      <w:lvlText w:val=""/>
+      <w:lvlJc w:val="left"/>
+      <w:pPr>
+        <w:tabs>
+          <w:tab w:val="num" w:pos="2160"/>
+        </w:tabs>
+        <w:ind w:left="2160" w:hanging="360"/>
+      </w:pPr>
+      <w:rPr>
+        <w:rFonts w:ascii="Wingdings" w:hAnsi="Wingdings" w:hint="default"/>
+        <w:sz w:val="20"/>
+      </w:rPr>
+    </w:lvl>
+    <w:lvl w:ilvl="3" w:tentative="1">
+      <w:start w:val="1"/>
+      <w:numFmt w:val="bullet"/>
+      <w:lvlText w:val=""/>
+      <w:lvlJc w:val="left"/>
+      <w:pPr>
+        <w:tabs>
+          <w:tab w:val="num" w:pos="2880"/>
+        </w:tabs>
+        <w:ind w:left="2880" w:hanging="360"/>
+      </w:pPr>
+      <w:rPr>
+        <w:rFonts w:ascii="Wingdings" w:hAnsi="Wingdings" w:hint="default"/>
+        <w:sz w:val="20"/>
+      </w:rPr>
+    </w:lvl>
+    <w:lvl w:ilvl="4" w:tentative="1">
+      <w:start w:val="1"/>
+      <w:numFmt w:val="bullet"/>
+      <w:lvlText w:val=""/>
+      <w:lvlJc w:val="left"/>
+      <w:pPr>
+        <w:tabs>
+          <w:tab w:val="num" w:pos="3600"/>
+        </w:tabs>
+        <w:ind w:left="3600" w:hanging="360"/>
+      </w:pPr>
+      <w:rPr>
+        <w:rFonts w:ascii="Wingdings" w:hAnsi="Wingdings" w:hint="default"/>
+        <w:sz w:val="20"/>
+      </w:rPr>
+    </w:lvl>
+    <w:lvl w:ilvl="5" w:tentative="1">
+      <w:start w:val="1"/>
+      <w:numFmt w:val="bullet"/>
+      <w:lvlText w:val=""/>
+      <w:lvlJc w:val="left"/>
+      <w:pPr>
+        <w:tabs>
+          <w:tab w:val="num" w:pos="4320"/>
+        </w:tabs>
+        <w:ind w:left="4320" w:hanging="360"/>
+      </w:pPr>
+      <w:rPr>
+        <w:rFonts w:ascii="Wingdings" w:hAnsi="Wingdings" w:hint="default"/>
+        <w:sz w:val="20"/>
+      </w:rPr>
+    </w:lvl>
+    <w:lvl w:ilvl="6" w:tentative="1">
+      <w:start w:val="1"/>
+      <w:numFmt w:val="bullet"/>
+      <w:lvlText w:val=""/>
+      <w:lvlJc w:val="left"/>
+      <w:pPr>
+        <w:tabs>
+          <w:tab w:val="num" w:pos="5040"/>
+        </w:tabs>
+        <w:ind w:left="5040" w:hanging="360"/>
+      </w:pPr>
+      <w:rPr>
+        <w:rFonts w:ascii="Wingdings" w:hAnsi="Wingdings" w:hint="default"/>
+        <w:sz w:val="20"/>
+      </w:rPr>
+    </w:lvl>
+    <w:lvl w:ilvl="7" w:tentative="1">
+      <w:start w:val="1"/>
+      <w:numFmt w:val="bullet"/>
+      <w:lvlText w:val=""/>
+      <w:lvlJc w:val="left"/>
+      <w:pPr>
+        <w:tabs>
+          <w:tab w:val="num" w:pos="5760"/>
+        </w:tabs>
+        <w:ind w:left="5760" w:hanging="360"/>
+      </w:pPr>
+      <w:rPr>
+        <w:rFonts w:ascii="Wingdings" w:hAnsi="Wingdings" w:hint="default"/>
+        <w:sz w:val="20"/>
+      </w:rPr>
+    </w:lvl>
+    <w:lvl w:ilvl="8" w:tentative="1">
+      <w:start w:val="1"/>
+      <w:numFmt w:val="bullet"/>
+      <w:lvlText w:val=""/>
+      <w:lvlJc w:val="left"/>
+      <w:pPr>
+        <w:tabs>
+          <w:tab w:val="num" w:pos="6480"/>
+        </w:tabs>
+        <w:ind w:left="6480" w:hanging="360"/>
+      </w:pPr>
+      <w:rPr>
+        <w:rFonts w:ascii="Wingdings" w:hAnsi="Wingdings" w:hint="default"/>
+        <w:sz w:val="20"/>
+      </w:rPr>
+    </w:lvl>
+  </w:abstractNum>
+  <w:abstractNum w:abstractNumId="1" w15:restartNumberingAfterBreak="0">
     <w:nsid w:val="11A92EC7"/>
     <w:multiLevelType w:val="multilevel"/>
     <w:tmpl w:val="9AF4ED64"/>
@@ -883,7 +1504,7 @@
       </w:rPr>
     </w:lvl>
   </w:abstractNum>
-  <w:abstractNum w:abstractNumId="1" w15:restartNumberingAfterBreak="0">
+  <w:abstractNum w:abstractNumId="2" w15:restartNumberingAfterBreak="0">
     <w:nsid w:val="22182A05"/>
     <w:multiLevelType w:val="multilevel"/>
     <w:tmpl w:val="83E6A81A"/>
@@ -1032,7 +1653,7 @@
       </w:rPr>
     </w:lvl>
   </w:abstractNum>
-  <w:abstractNum w:abstractNumId="2" w15:restartNumberingAfterBreak="0">
+  <w:abstractNum w:abstractNumId="3" w15:restartNumberingAfterBreak="0">
     <w:nsid w:val="240E5AB7"/>
     <w:multiLevelType w:val="multilevel"/>
     <w:tmpl w:val="F3E64B68"/>
@@ -1181,7 +1802,7 @@
       </w:rPr>
     </w:lvl>
   </w:abstractNum>
-  <w:abstractNum w:abstractNumId="3" w15:restartNumberingAfterBreak="0">
+  <w:abstractNum w:abstractNumId="4" w15:restartNumberingAfterBreak="0">
     <w:nsid w:val="3E5B64F1"/>
     <w:multiLevelType w:val="multilevel"/>
     <w:tmpl w:val="9322EF50"/>
@@ -1330,7 +1951,454 @@
       </w:rPr>
     </w:lvl>
   </w:abstractNum>
-  <w:abstractNum w:abstractNumId="4" w15:restartNumberingAfterBreak="0">
+  <w:abstractNum w:abstractNumId="5" w15:restartNumberingAfterBreak="0">
+    <w:nsid w:val="4D70771A"/>
+    <w:multiLevelType w:val="multilevel"/>
+    <w:tmpl w:val="07465B48"/>
+    <w:lvl w:ilvl="0">
+      <w:start w:val="1"/>
+      <w:numFmt w:val="bullet"/>
+      <w:lvlText w:val=""/>
+      <w:lvlJc w:val="left"/>
+      <w:pPr>
+        <w:tabs>
+          <w:tab w:val="num" w:pos="720"/>
+        </w:tabs>
+        <w:ind w:left="720" w:hanging="360"/>
+      </w:pPr>
+      <w:rPr>
+        <w:rFonts w:ascii="Symbol" w:hAnsi="Symbol" w:hint="default"/>
+        <w:sz w:val="20"/>
+      </w:rPr>
+    </w:lvl>
+    <w:lvl w:ilvl="1">
+      <w:start w:val="1"/>
+      <w:numFmt w:val="bullet"/>
+      <w:lvlText w:val="o"/>
+      <w:lvlJc w:val="left"/>
+      <w:pPr>
+        <w:tabs>
+          <w:tab w:val="num" w:pos="1440"/>
+        </w:tabs>
+        <w:ind w:left="1440" w:hanging="360"/>
+      </w:pPr>
+      <w:rPr>
+        <w:rFonts w:ascii="Courier New" w:hAnsi="Courier New" w:hint="default"/>
+        <w:sz w:val="20"/>
+      </w:rPr>
+    </w:lvl>
+    <w:lvl w:ilvl="2" w:tentative="1">
+      <w:start w:val="1"/>
+      <w:numFmt w:val="bullet"/>
+      <w:lvlText w:val=""/>
+      <w:lvlJc w:val="left"/>
+      <w:pPr>
+        <w:tabs>
+          <w:tab w:val="num" w:pos="2160"/>
+        </w:tabs>
+        <w:ind w:left="2160" w:hanging="360"/>
+      </w:pPr>
+      <w:rPr>
+        <w:rFonts w:ascii="Wingdings" w:hAnsi="Wingdings" w:hint="default"/>
+        <w:sz w:val="20"/>
+      </w:rPr>
+    </w:lvl>
+    <w:lvl w:ilvl="3" w:tentative="1">
+      <w:start w:val="1"/>
+      <w:numFmt w:val="bullet"/>
+      <w:lvlText w:val=""/>
+      <w:lvlJc w:val="left"/>
+      <w:pPr>
+        <w:tabs>
+          <w:tab w:val="num" w:pos="2880"/>
+        </w:tabs>
+        <w:ind w:left="2880" w:hanging="360"/>
+      </w:pPr>
+      <w:rPr>
+        <w:rFonts w:ascii="Wingdings" w:hAnsi="Wingdings" w:hint="default"/>
+        <w:sz w:val="20"/>
+      </w:rPr>
+    </w:lvl>
+    <w:lvl w:ilvl="4" w:tentative="1">
+      <w:start w:val="1"/>
+      <w:numFmt w:val="bullet"/>
+      <w:lvlText w:val=""/>
+      <w:lvlJc w:val="left"/>
+      <w:pPr>
+        <w:tabs>
+          <w:tab w:val="num" w:pos="3600"/>
+        </w:tabs>
+        <w:ind w:left="3600" w:hanging="360"/>
+      </w:pPr>
+      <w:rPr>
+        <w:rFonts w:ascii="Wingdings" w:hAnsi="Wingdings" w:hint="default"/>
+        <w:sz w:val="20"/>
+      </w:rPr>
+    </w:lvl>
+    <w:lvl w:ilvl="5" w:tentative="1">
+      <w:start w:val="1"/>
+      <w:numFmt w:val="bullet"/>
+      <w:lvlText w:val=""/>
+      <w:lvlJc w:val="left"/>
+      <w:pPr>
+        <w:tabs>
+          <w:tab w:val="num" w:pos="4320"/>
+        </w:tabs>
+        <w:ind w:left="4320" w:hanging="360"/>
+      </w:pPr>
+      <w:rPr>
+        <w:rFonts w:ascii="Wingdings" w:hAnsi="Wingdings" w:hint="default"/>
+        <w:sz w:val="20"/>
+      </w:rPr>
+    </w:lvl>
+    <w:lvl w:ilvl="6" w:tentative="1">
+      <w:start w:val="1"/>
+      <w:numFmt w:val="bullet"/>
+      <w:lvlText w:val=""/>
+      <w:lvlJc w:val="left"/>
+      <w:pPr>
+        <w:tabs>
+          <w:tab w:val="num" w:pos="5040"/>
+        </w:tabs>
+        <w:ind w:left="5040" w:hanging="360"/>
+      </w:pPr>
+      <w:rPr>
+        <w:rFonts w:ascii="Wingdings" w:hAnsi="Wingdings" w:hint="default"/>
+        <w:sz w:val="20"/>
+      </w:rPr>
+    </w:lvl>
+    <w:lvl w:ilvl="7" w:tentative="1">
+      <w:start w:val="1"/>
+      <w:numFmt w:val="bullet"/>
+      <w:lvlText w:val=""/>
+      <w:lvlJc w:val="left"/>
+      <w:pPr>
+        <w:tabs>
+          <w:tab w:val="num" w:pos="5760"/>
+        </w:tabs>
+        <w:ind w:left="5760" w:hanging="360"/>
+      </w:pPr>
+      <w:rPr>
+        <w:rFonts w:ascii="Wingdings" w:hAnsi="Wingdings" w:hint="default"/>
+        <w:sz w:val="20"/>
+      </w:rPr>
+    </w:lvl>
+    <w:lvl w:ilvl="8" w:tentative="1">
+      <w:start w:val="1"/>
+      <w:numFmt w:val="bullet"/>
+      <w:lvlText w:val=""/>
+      <w:lvlJc w:val="left"/>
+      <w:pPr>
+        <w:tabs>
+          <w:tab w:val="num" w:pos="6480"/>
+        </w:tabs>
+        <w:ind w:left="6480" w:hanging="360"/>
+      </w:pPr>
+      <w:rPr>
+        <w:rFonts w:ascii="Wingdings" w:hAnsi="Wingdings" w:hint="default"/>
+        <w:sz w:val="20"/>
+      </w:rPr>
+    </w:lvl>
+  </w:abstractNum>
+  <w:abstractNum w:abstractNumId="6" w15:restartNumberingAfterBreak="0">
+    <w:nsid w:val="4EF26A99"/>
+    <w:multiLevelType w:val="multilevel"/>
+    <w:tmpl w:val="92CADBAA"/>
+    <w:lvl w:ilvl="0">
+      <w:start w:val="1"/>
+      <w:numFmt w:val="bullet"/>
+      <w:lvlText w:val=""/>
+      <w:lvlJc w:val="left"/>
+      <w:pPr>
+        <w:tabs>
+          <w:tab w:val="num" w:pos="720"/>
+        </w:tabs>
+        <w:ind w:left="720" w:hanging="360"/>
+      </w:pPr>
+      <w:rPr>
+        <w:rFonts w:ascii="Symbol" w:hAnsi="Symbol" w:hint="default"/>
+        <w:sz w:val="20"/>
+      </w:rPr>
+    </w:lvl>
+    <w:lvl w:ilvl="1" w:tentative="1">
+      <w:start w:val="1"/>
+      <w:numFmt w:val="bullet"/>
+      <w:lvlText w:val="o"/>
+      <w:lvlJc w:val="left"/>
+      <w:pPr>
+        <w:tabs>
+          <w:tab w:val="num" w:pos="1440"/>
+        </w:tabs>
+        <w:ind w:left="1440" w:hanging="360"/>
+      </w:pPr>
+      <w:rPr>
+        <w:rFonts w:ascii="Courier New" w:hAnsi="Courier New" w:hint="default"/>
+        <w:sz w:val="20"/>
+      </w:rPr>
+    </w:lvl>
+    <w:lvl w:ilvl="2" w:tentative="1">
+      <w:start w:val="1"/>
+      <w:numFmt w:val="bullet"/>
+      <w:lvlText w:val=""/>
+      <w:lvlJc w:val="left"/>
+      <w:pPr>
+        <w:tabs>
+          <w:tab w:val="num" w:pos="2160"/>
+        </w:tabs>
+        <w:ind w:left="2160" w:hanging="360"/>
+      </w:pPr>
+      <w:rPr>
+        <w:rFonts w:ascii="Wingdings" w:hAnsi="Wingdings" w:hint="default"/>
+        <w:sz w:val="20"/>
+      </w:rPr>
+    </w:lvl>
+    <w:lvl w:ilvl="3" w:tentative="1">
+      <w:start w:val="1"/>
+      <w:numFmt w:val="bullet"/>
+      <w:lvlText w:val=""/>
+      <w:lvlJc w:val="left"/>
+      <w:pPr>
+        <w:tabs>
+          <w:tab w:val="num" w:pos="2880"/>
+        </w:tabs>
+        <w:ind w:left="2880" w:hanging="360"/>
+      </w:pPr>
+      <w:rPr>
+        <w:rFonts w:ascii="Wingdings" w:hAnsi="Wingdings" w:hint="default"/>
+        <w:sz w:val="20"/>
+      </w:rPr>
+    </w:lvl>
+    <w:lvl w:ilvl="4" w:tentative="1">
+      <w:start w:val="1"/>
+      <w:numFmt w:val="bullet"/>
+      <w:lvlText w:val=""/>
+      <w:lvlJc w:val="left"/>
+      <w:pPr>
+        <w:tabs>
+          <w:tab w:val="num" w:pos="3600"/>
+        </w:tabs>
+        <w:ind w:left="3600" w:hanging="360"/>
+      </w:pPr>
+      <w:rPr>
+        <w:rFonts w:ascii="Wingdings" w:hAnsi="Wingdings" w:hint="default"/>
+        <w:sz w:val="20"/>
+      </w:rPr>
+    </w:lvl>
+    <w:lvl w:ilvl="5" w:tentative="1">
+      <w:start w:val="1"/>
+      <w:numFmt w:val="bullet"/>
+      <w:lvlText w:val=""/>
+      <w:lvlJc w:val="left"/>
+      <w:pPr>
+        <w:tabs>
+          <w:tab w:val="num" w:pos="4320"/>
+        </w:tabs>
+        <w:ind w:left="4320" w:hanging="360"/>
+      </w:pPr>
+      <w:rPr>
+        <w:rFonts w:ascii="Wingdings" w:hAnsi="Wingdings" w:hint="default"/>
+        <w:sz w:val="20"/>
+      </w:rPr>
+    </w:lvl>
+    <w:lvl w:ilvl="6" w:tentative="1">
+      <w:start w:val="1"/>
+      <w:numFmt w:val="bullet"/>
+      <w:lvlText w:val=""/>
+      <w:lvlJc w:val="left"/>
+      <w:pPr>
+        <w:tabs>
+          <w:tab w:val="num" w:pos="5040"/>
+        </w:tabs>
+        <w:ind w:left="5040" w:hanging="360"/>
+      </w:pPr>
+      <w:rPr>
+        <w:rFonts w:ascii="Wingdings" w:hAnsi="Wingdings" w:hint="default"/>
+        <w:sz w:val="20"/>
+      </w:rPr>
+    </w:lvl>
+    <w:lvl w:ilvl="7" w:tentative="1">
+      <w:start w:val="1"/>
+      <w:numFmt w:val="bullet"/>
+      <w:lvlText w:val=""/>
+      <w:lvlJc w:val="left"/>
+      <w:pPr>
+        <w:tabs>
+          <w:tab w:val="num" w:pos="5760"/>
+        </w:tabs>
+        <w:ind w:left="5760" w:hanging="360"/>
+      </w:pPr>
+      <w:rPr>
+        <w:rFonts w:ascii="Wingdings" w:hAnsi="Wingdings" w:hint="default"/>
+        <w:sz w:val="20"/>
+      </w:rPr>
+    </w:lvl>
+    <w:lvl w:ilvl="8" w:tentative="1">
+      <w:start w:val="1"/>
+      <w:numFmt w:val="bullet"/>
+      <w:lvlText w:val=""/>
+      <w:lvlJc w:val="left"/>
+      <w:pPr>
+        <w:tabs>
+          <w:tab w:val="num" w:pos="6480"/>
+        </w:tabs>
+        <w:ind w:left="6480" w:hanging="360"/>
+      </w:pPr>
+      <w:rPr>
+        <w:rFonts w:ascii="Wingdings" w:hAnsi="Wingdings" w:hint="default"/>
+        <w:sz w:val="20"/>
+      </w:rPr>
+    </w:lvl>
+  </w:abstractNum>
+  <w:abstractNum w:abstractNumId="7" w15:restartNumberingAfterBreak="0">
+    <w:nsid w:val="6368684A"/>
+    <w:multiLevelType w:val="multilevel"/>
+    <w:tmpl w:val="73B2D6EA"/>
+    <w:lvl w:ilvl="0">
+      <w:start w:val="1"/>
+      <w:numFmt w:val="bullet"/>
+      <w:lvlText w:val=""/>
+      <w:lvlJc w:val="left"/>
+      <w:pPr>
+        <w:tabs>
+          <w:tab w:val="num" w:pos="720"/>
+        </w:tabs>
+        <w:ind w:left="720" w:hanging="360"/>
+      </w:pPr>
+      <w:rPr>
+        <w:rFonts w:ascii="Symbol" w:hAnsi="Symbol" w:hint="default"/>
+        <w:sz w:val="20"/>
+      </w:rPr>
+    </w:lvl>
+    <w:lvl w:ilvl="1" w:tentative="1">
+      <w:start w:val="1"/>
+      <w:numFmt w:val="bullet"/>
+      <w:lvlText w:val="o"/>
+      <w:lvlJc w:val="left"/>
+      <w:pPr>
+        <w:tabs>
+          <w:tab w:val="num" w:pos="1440"/>
+        </w:tabs>
+        <w:ind w:left="1440" w:hanging="360"/>
+      </w:pPr>
+      <w:rPr>
+        <w:rFonts w:ascii="Courier New" w:hAnsi="Courier New" w:hint="default"/>
+        <w:sz w:val="20"/>
+      </w:rPr>
+    </w:lvl>
+    <w:lvl w:ilvl="2" w:tentative="1">
+      <w:start w:val="1"/>
+      <w:numFmt w:val="bullet"/>
+      <w:lvlText w:val=""/>
+      <w:lvlJc w:val="left"/>
+      <w:pPr>
+        <w:tabs>
+          <w:tab w:val="num" w:pos="2160"/>
+        </w:tabs>
+        <w:ind w:left="2160" w:hanging="360"/>
+      </w:pPr>
+      <w:rPr>
+        <w:rFonts w:ascii="Wingdings" w:hAnsi="Wingdings" w:hint="default"/>
+        <w:sz w:val="20"/>
+      </w:rPr>
+    </w:lvl>
+    <w:lvl w:ilvl="3" w:tentative="1">
+      <w:start w:val="1"/>
+      <w:numFmt w:val="bullet"/>
+      <w:lvlText w:val=""/>
+      <w:lvlJc w:val="left"/>
+      <w:pPr>
+        <w:tabs>
+          <w:tab w:val="num" w:pos="2880"/>
+        </w:tabs>
+        <w:ind w:left="2880" w:hanging="360"/>
+      </w:pPr>
+      <w:rPr>
+        <w:rFonts w:ascii="Wingdings" w:hAnsi="Wingdings" w:hint="default"/>
+        <w:sz w:val="20"/>
+      </w:rPr>
+    </w:lvl>
+    <w:lvl w:ilvl="4" w:tentative="1">
+      <w:start w:val="1"/>
+      <w:numFmt w:val="bullet"/>
+      <w:lvlText w:val=""/>
+      <w:lvlJc w:val="left"/>
+      <w:pPr>
+        <w:tabs>
+          <w:tab w:val="num" w:pos="3600"/>
+        </w:tabs>
+        <w:ind w:left="3600" w:hanging="360"/>
+      </w:pPr>
+      <w:rPr>
+        <w:rFonts w:ascii="Wingdings" w:hAnsi="Wingdings" w:hint="default"/>
+        <w:sz w:val="20"/>
+      </w:rPr>
+    </w:lvl>
+    <w:lvl w:ilvl="5" w:tentative="1">
+      <w:start w:val="1"/>
+      <w:numFmt w:val="bullet"/>
+      <w:lvlText w:val=""/>
+      <w:lvlJc w:val="left"/>
+      <w:pPr>
+        <w:tabs>
+          <w:tab w:val="num" w:pos="4320"/>
+        </w:tabs>
+        <w:ind w:left="4320" w:hanging="360"/>
+      </w:pPr>
+      <w:rPr>
+        <w:rFonts w:ascii="Wingdings" w:hAnsi="Wingdings" w:hint="default"/>
+        <w:sz w:val="20"/>
+      </w:rPr>
+    </w:lvl>
+    <w:lvl w:ilvl="6" w:tentative="1">
+      <w:start w:val="1"/>
+      <w:numFmt w:val="bullet"/>
+      <w:lvlText w:val=""/>
+      <w:lvlJc w:val="left"/>
+      <w:pPr>
+        <w:tabs>
+          <w:tab w:val="num" w:pos="5040"/>
+        </w:tabs>
+        <w:ind w:left="5040" w:hanging="360"/>
+      </w:pPr>
+      <w:rPr>
+        <w:rFonts w:ascii="Wingdings" w:hAnsi="Wingdings" w:hint="default"/>
+        <w:sz w:val="20"/>
+      </w:rPr>
+    </w:lvl>
+    <w:lvl w:ilvl="7" w:tentative="1">
+      <w:start w:val="1"/>
+      <w:numFmt w:val="bullet"/>
+      <w:lvlText w:val=""/>
+      <w:lvlJc w:val="left"/>
+      <w:pPr>
+        <w:tabs>
+          <w:tab w:val="num" w:pos="5760"/>
+        </w:tabs>
+        <w:ind w:left="5760" w:hanging="360"/>
+      </w:pPr>
+      <w:rPr>
+        <w:rFonts w:ascii="Wingdings" w:hAnsi="Wingdings" w:hint="default"/>
+        <w:sz w:val="20"/>
+      </w:rPr>
+    </w:lvl>
+    <w:lvl w:ilvl="8" w:tentative="1">
+      <w:start w:val="1"/>
+      <w:numFmt w:val="bullet"/>
+      <w:lvlText w:val=""/>
+      <w:lvlJc w:val="left"/>
+      <w:pPr>
+        <w:tabs>
+          <w:tab w:val="num" w:pos="6480"/>
+        </w:tabs>
+        <w:ind w:left="6480" w:hanging="360"/>
+      </w:pPr>
+      <w:rPr>
+        <w:rFonts w:ascii="Wingdings" w:hAnsi="Wingdings" w:hint="default"/>
+        <w:sz w:val="20"/>
+      </w:rPr>
+    </w:lvl>
+  </w:abstractNum>
+  <w:abstractNum w:abstractNumId="8" w15:restartNumberingAfterBreak="0">
     <w:nsid w:val="66017366"/>
     <w:multiLevelType w:val="multilevel"/>
     <w:tmpl w:val="E2B27642"/>
@@ -1479,7 +2547,7 @@
       </w:rPr>
     </w:lvl>
   </w:abstractNum>
-  <w:abstractNum w:abstractNumId="5" w15:restartNumberingAfterBreak="0">
+  <w:abstractNum w:abstractNumId="9" w15:restartNumberingAfterBreak="0">
     <w:nsid w:val="6FE44DD1"/>
     <w:multiLevelType w:val="multilevel"/>
     <w:tmpl w:val="FD069A90"/>
@@ -1629,22 +2697,34 @@
     </w:lvl>
   </w:abstractNum>
   <w:num w:numId="1" w16cid:durableId="255525090">
-    <w:abstractNumId w:val="5"/>
+    <w:abstractNumId w:val="9"/>
   </w:num>
   <w:num w:numId="2" w16cid:durableId="1376345578">
+    <w:abstractNumId w:val="1"/>
+  </w:num>
+  <w:num w:numId="3" w16cid:durableId="862740685">
+    <w:abstractNumId w:val="2"/>
+  </w:num>
+  <w:num w:numId="4" w16cid:durableId="356740534">
+    <w:abstractNumId w:val="8"/>
+  </w:num>
+  <w:num w:numId="5" w16cid:durableId="829758937">
+    <w:abstractNumId w:val="3"/>
+  </w:num>
+  <w:num w:numId="6" w16cid:durableId="1147235964">
+    <w:abstractNumId w:val="4"/>
+  </w:num>
+  <w:num w:numId="7" w16cid:durableId="1159468633">
+    <w:abstractNumId w:val="6"/>
+  </w:num>
+  <w:num w:numId="8" w16cid:durableId="237862042">
     <w:abstractNumId w:val="0"/>
   </w:num>
-  <w:num w:numId="3" w16cid:durableId="862740685">
-    <w:abstractNumId w:val="1"/>
+  <w:num w:numId="9" w16cid:durableId="677925147">
+    <w:abstractNumId w:val="7"/>
   </w:num>
-  <w:num w:numId="4" w16cid:durableId="356740534">
-    <w:abstractNumId w:val="4"/>
-  </w:num>
-  <w:num w:numId="5" w16cid:durableId="829758937">
-    <w:abstractNumId w:val="2"/>
-  </w:num>
-  <w:num w:numId="6" w16cid:durableId="1147235964">
-    <w:abstractNumId w:val="3"/>
+  <w:num w:numId="10" w16cid:durableId="552497528">
+    <w:abstractNumId w:val="5"/>
   </w:num>
 </w:numbering>
 </file>
@@ -2057,7 +3137,7 @@
     <w:link w:val="Titre1Car"/>
     <w:uiPriority w:val="9"/>
     <w:qFormat/>
-    <w:rsid w:val="002546CB"/>
+    <w:rsid w:val="00D7468A"/>
     <w:pPr>
       <w:keepNext/>
       <w:keepLines/>
@@ -2066,7 +3146,7 @@
     </w:pPr>
     <w:rPr>
       <w:rFonts w:asciiTheme="majorHAnsi" w:eastAsiaTheme="majorEastAsia" w:hAnsiTheme="majorHAnsi" w:cstheme="majorBidi"/>
-      <w:color w:val="2F5496" w:themeColor="accent1" w:themeShade="BF"/>
+      <w:color w:val="C00000"/>
       <w:sz w:val="40"/>
       <w:szCs w:val="40"/>
     </w:rPr>
@@ -2280,10 +3360,10 @@
     <w:basedOn w:val="Policepardfaut"/>
     <w:link w:val="Titre1"/>
     <w:uiPriority w:val="9"/>
-    <w:rsid w:val="002546CB"/>
+    <w:rsid w:val="00D7468A"/>
     <w:rPr>
       <w:rFonts w:asciiTheme="majorHAnsi" w:eastAsiaTheme="majorEastAsia" w:hAnsiTheme="majorHAnsi" w:cstheme="majorBidi"/>
-      <w:color w:val="2F5496" w:themeColor="accent1" w:themeShade="BF"/>
+      <w:color w:val="C00000"/>
       <w:sz w:val="40"/>
       <w:szCs w:val="40"/>
     </w:rPr>
@@ -2401,13 +3481,16 @@
     <w:link w:val="TitreCar"/>
     <w:uiPriority w:val="10"/>
     <w:qFormat/>
-    <w:rsid w:val="002546CB"/>
+    <w:rsid w:val="00D7468A"/>
     <w:pPr>
       <w:spacing w:after="80" w:line="240" w:lineRule="auto"/>
       <w:contextualSpacing/>
+      <w:jc w:val="center"/>
     </w:pPr>
     <w:rPr>
       <w:rFonts w:asciiTheme="majorHAnsi" w:eastAsiaTheme="majorEastAsia" w:hAnsiTheme="majorHAnsi" w:cstheme="majorBidi"/>
+      <w:b/>
+      <w:bCs/>
       <w:spacing w:val="-10"/>
       <w:kern w:val="28"/>
       <w:sz w:val="56"/>
@@ -2419,9 +3502,11 @@
     <w:basedOn w:val="Policepardfaut"/>
     <w:link w:val="Titre"/>
     <w:uiPriority w:val="10"/>
-    <w:rsid w:val="002546CB"/>
+    <w:rsid w:val="00D7468A"/>
     <w:rPr>
       <w:rFonts w:asciiTheme="majorHAnsi" w:eastAsiaTheme="majorEastAsia" w:hAnsiTheme="majorHAnsi" w:cstheme="majorBidi"/>
+      <w:b/>
+      <w:bCs/>
       <w:spacing w:val="-10"/>
       <w:kern w:val="28"/>
       <w:sz w:val="56"/>

</xml_diff>